<commit_message>
x86 Design Document: GDB caution for M-series Macs in Warning section
Co-Authored-By: Claude Fable 5 <noreply@anthropic.com>
</commit_message>
<xml_diff>
--- a/x86/Design Document.docx
+++ b/x86/Design Document.docx
@@ -192,26 +192,44 @@
       </w:pPr>
       <w:r>
         <w:rPr>
-          <w:rtl w:val="0"/>
-        </w:rPr>
-      </w:r>
-    </w:p>
-    <w:p>
-      <w:pPr>
-        <w:rPr>
-          <w:rFonts w:ascii="Times New Roman" w:cs="Times New Roman" w:eastAsia="Times New Roman" w:hAnsi="Times New Roman"/>
-          <w:sz w:val="24"/>
-          <w:szCs w:val="24"/>
-        </w:rPr>
-      </w:pPr>
-      <w:r>
-        <w:rPr>
           <w:rFonts w:ascii="Times New Roman" w:cs="Times New Roman" w:eastAsia="Times New Roman" w:hAnsi="Times New Roman"/>
           <w:sz w:val="24"/>
           <w:szCs w:val="24"/>
           <w:rtl w:val="0"/>
         </w:rPr>
         <w:t xml:space="preserve">While for the purposes of this course, this IDE would work, students should also explore on their own regarding IDE setup.</w:t>
+      </w:r>
+    </w:p>
+    <w:p>
+      <w:pPr>
+        <w:rPr>
+          <w:rFonts w:ascii="Times New Roman" w:cs="Times New Roman" w:eastAsia="Times New Roman" w:hAnsi="Times New Roman"/>
+          <w:sz w:val="24"/>
+          <w:szCs w:val="24"/>
+        </w:rPr>
+      </w:pPr>
+      <w:r>
+        <w:rPr>
+          <w:rtl w:val="0"/>
+        </w:rPr>
+      </w:r>
+    </w:p>
+    <w:p>
+      <w:pPr>
+        <w:rPr>
+          <w:rFonts w:ascii="Times New Roman" w:cs="Times New Roman" w:eastAsia="Times New Roman" w:hAnsi="Times New Roman"/>
+          <w:sz w:val="24"/>
+          <w:szCs w:val="24"/>
+        </w:rPr>
+      </w:pPr>
+      <w:r>
+        <w:rPr>
+          <w:rFonts w:ascii="Times New Roman" w:cs="Times New Roman" w:eastAsia="Times New Roman" w:hAnsi="Times New Roman"/>
+          <w:sz w:val="24"/>
+          <w:szCs w:val="24"/>
+          <w:rtl w:val="0"/>
+        </w:rPr>
+        <w:t xml:space="preserve">Additionally, there are known issues regarding the GDB debugger and its outputs in M-series macs. Code still compiles and outputs cleanly, but be wary when using GDB</w:t>
       </w:r>
     </w:p>
     <w:p>
@@ -377,20 +395,6 @@
           <w:rtl w:val="0"/>
         </w:rPr>
         <w:t xml:space="preserve"> You can simply download Docker to your respective machine and run the program! Happy Coding!</w:t>
-      </w:r>
-    </w:p>
-    <w:p>
-      <w:pPr>
-        <w:rPr>
-          <w:rFonts w:ascii="Times New Roman" w:cs="Times New Roman" w:eastAsia="Times New Roman" w:hAnsi="Times New Roman"/>
-          <w:sz w:val="24"/>
-          <w:szCs w:val="24"/>
-        </w:rPr>
-      </w:pPr>
-      <w:r>
-        <w:rPr>
-          <w:rtl w:val="0"/>
-        </w:rPr>
       </w:r>
     </w:p>
     <w:p>
@@ -535,20 +539,6 @@
       <w:pPr>
         <w:rPr>
           <w:rFonts w:ascii="Times New Roman" w:cs="Times New Roman" w:eastAsia="Times New Roman" w:hAnsi="Times New Roman"/>
-          <w:sz w:val="24"/>
-          <w:szCs w:val="24"/>
-        </w:rPr>
-      </w:pPr>
-      <w:r>
-        <w:rPr>
-          <w:rtl w:val="0"/>
-        </w:rPr>
-      </w:r>
-    </w:p>
-    <w:p>
-      <w:pPr>
-        <w:rPr>
-          <w:rFonts w:ascii="Times New Roman" w:cs="Times New Roman" w:eastAsia="Times New Roman" w:hAnsi="Times New Roman"/>
           <w:b w:val="1"/>
           <w:bCs w:val="1"/>
           <w:sz w:val="24"/>
@@ -720,12 +710,12 @@
           <wp:inline distB="114300" distT="114300" distL="114300" distR="114300">
             <wp:extent cx="5386388" cy="4224425"/>
             <wp:effectExtent b="0" l="0" r="0" t="0"/>
-            <wp:docPr id="2" name="image3.png"/>
+            <wp:docPr id="2" name="image4.png"/>
             <a:graphic>
               <a:graphicData uri="http://schemas.openxmlformats.org/drawingml/2006/picture">
                 <pic:pic>
                   <pic:nvPicPr>
-                    <pic:cNvPr id="0" name="image3.png"/>
+                    <pic:cNvPr id="0" name="image4.png"/>
                     <pic:cNvPicPr preferRelativeResize="0"/>
                   </pic:nvPicPr>
                   <pic:blipFill>
@@ -905,12 +895,12 @@
           <wp:inline distB="114300" distT="114300" distL="114300" distR="114300">
             <wp:extent cx="5595938" cy="3989696"/>
             <wp:effectExtent b="0" l="0" r="0" t="0"/>
-            <wp:docPr id="4" name="image5.png"/>
+            <wp:docPr id="4" name="image1.png"/>
             <a:graphic>
               <a:graphicData uri="http://schemas.openxmlformats.org/drawingml/2006/picture">
                 <pic:pic>
                   <pic:nvPicPr>
-                    <pic:cNvPr id="0" name="image5.png"/>
+                    <pic:cNvPr id="0" name="image1.png"/>
                     <pic:cNvPicPr preferRelativeResize="0"/>
                   </pic:nvPicPr>
                   <pic:blipFill>
@@ -1147,12 +1137,12 @@
           <wp:inline distB="114300" distT="114300" distL="114300" distR="114300">
             <wp:extent cx="5943600" cy="1739900"/>
             <wp:effectExtent b="0" l="0" r="0" t="0"/>
-            <wp:docPr id="3" name="image1.png"/>
+            <wp:docPr id="3" name="image2.png"/>
             <a:graphic>
               <a:graphicData uri="http://schemas.openxmlformats.org/drawingml/2006/picture">
                 <pic:pic>
                   <pic:nvPicPr>
-                    <pic:cNvPr id="0" name="image1.png"/>
+                    <pic:cNvPr id="0" name="image2.png"/>
                     <pic:cNvPicPr preferRelativeResize="0"/>
                   </pic:nvPicPr>
                   <pic:blipFill>
@@ -1334,12 +1324,12 @@
           <wp:inline distB="114300" distT="114300" distL="114300" distR="114300">
             <wp:extent cx="5943600" cy="2565400"/>
             <wp:effectExtent b="0" l="0" r="0" t="0"/>
-            <wp:docPr id="6" name="image2.png"/>
+            <wp:docPr id="6" name="image3.png"/>
             <a:graphic>
               <a:graphicData uri="http://schemas.openxmlformats.org/drawingml/2006/picture">
                 <pic:pic>
                   <pic:nvPicPr>
-                    <pic:cNvPr id="0" name="image2.png"/>
+                    <pic:cNvPr id="0" name="image3.png"/>
                     <pic:cNvPicPr preferRelativeResize="0"/>
                   </pic:nvPicPr>
                   <pic:blipFill>
@@ -1933,12 +1923,12 @@
           <wp:inline distB="114300" distT="114300" distL="114300" distR="114300">
             <wp:extent cx="5943600" cy="2616200"/>
             <wp:effectExtent b="0" l="0" r="0" t="0"/>
-            <wp:docPr id="1" name="image4.png"/>
+            <wp:docPr id="1" name="image5.png"/>
             <a:graphic>
               <a:graphicData uri="http://schemas.openxmlformats.org/drawingml/2006/picture">
                 <pic:pic>
                   <pic:nvPicPr>
-                    <pic:cNvPr id="0" name="image4.png"/>
+                    <pic:cNvPr id="0" name="image5.png"/>
                     <pic:cNvPicPr preferRelativeResize="0"/>
                   </pic:nvPicPr>
                   <pic:blipFill>

</xml_diff>